<commit_message>
feat: add lead matter engagement workflow
</commit_message>
<xml_diff>
--- a/assets/engagement-agreements/ep-trust-couple-v1.docx
+++ b/assets/engagement-agreements/ep-trust-couple-v1.docx
@@ -1527,6 +1527,46 @@
       </w:pPr>
     </w:p>
     <w:p>
+      <w:r>
+        <w:rPr>
+          <w:b/>
+        </w:rPr>
+        <w:t>Additional Clauses</w:t>
+      </w:r>
+    </w:p>
+    <w:p>
+      <w:r>
+        <w:rPr>
+          <w:b w:val="0"/>
+        </w:rPr>
+        <w:t>{#additional_clauses}</w:t>
+      </w:r>
+    </w:p>
+    <w:p>
+      <w:r>
+        <w:rPr>
+          <w:b/>
+        </w:rPr>
+        <w:t>{title}</w:t>
+      </w:r>
+    </w:p>
+    <w:p>
+      <w:r>
+        <w:rPr>
+          <w:b w:val="0"/>
+        </w:rPr>
+        <w:t>{text}</w:t>
+      </w:r>
+    </w:p>
+    <w:p>
+      <w:r>
+        <w:rPr>
+          <w:b w:val="0"/>
+        </w:rPr>
+        <w:t>{/additional_clauses}</w:t>
+      </w:r>
+    </w:p>
+    <w:p>
       <w:pPr>
         <w:spacing w:after="160" w:line="278" w:lineRule="auto"/>
         <w:jc w:val="center"/>
@@ -1976,6 +2016,29 @@
           <w:szCs w:val="22"/>
         </w:rPr>
       </w:pPr>
+    </w:p>
+    <w:p>
+      <w:r>
+        <w:t>{#schedule_a_clauses}</w:t>
+      </w:r>
+    </w:p>
+    <w:p>
+      <w:r>
+        <w:rPr>
+          <w:b/>
+        </w:rPr>
+        <w:t>{title}</w:t>
+      </w:r>
+    </w:p>
+    <w:p>
+      <w:r>
+        <w:t>{text}</w:t>
+      </w:r>
+    </w:p>
+    <w:p>
+      <w:r>
+        <w:t>{/schedule_a_clauses}</w:t>
+      </w:r>
     </w:p>
     <w:sectPr>
       <w:footerReference w:type="default" r:id="rId9"/>

</xml_diff>